<commit_message>
feat(rfq): carry a tender's pinned notes into RFR PDF/Word documents
</commit_message>
<xml_diff>
--- a/apps/server/templates/rfr.docx
+++ b/apps/server/templates/rfr.docx
@@ -38,6 +38,24 @@
     <w:p>
       <w:r>
         <w:t xml:space="preserve">{{instructionsLine}}</w:t>
+      </w:r>
+    </w:p>
+    <w:p>
+      <w:r>
+        <w:rPr>
+          <w:b/>
+        </w:rPr>
+        <w:t xml:space="preserve">{{#hasPinnedNotes}}Important Notes:</w:t>
+      </w:r>
+    </w:p>
+    <w:p>
+      <w:r>
+        <w:t xml:space="preserve">{{#pinnedNotes}}{{.}}{{/pinnedNotes}}</w:t>
+      </w:r>
+    </w:p>
+    <w:p>
+      <w:r>
+        <w:t xml:space="preserve">{{/hasPinnedNotes}}</w:t>
       </w:r>
     </w:p>
     <w:p/>

</xml_diff>

<commit_message>
fix(rfq): put Docxtemplater pinned-notes loop tags in their own paragraphs
Inline {{#pinnedNotes}}{{.}}{{/pinnedNotes}} inside one paragraph's single
run concatenated every pinned note with no separator in the generated Word
document. paragraphLoop only repeats per-paragraph when the loop tags are
each alone in their own paragraph. Strengthens the regression test, which
previously used toContain assertions that passed on the broken output.

Co-Authored-By: Claude Sonnet 5 <noreply@anthropic.com>
</commit_message>
<xml_diff>
--- a/apps/server/templates/rfr.docx
+++ b/apps/server/templates/rfr.docx
@@ -42,15 +42,30 @@
     </w:p>
     <w:p>
       <w:r>
+        <w:t xml:space="preserve">{{#hasPinnedNotes}}</w:t>
+      </w:r>
+    </w:p>
+    <w:p>
+      <w:r>
         <w:rPr>
           <w:b/>
         </w:rPr>
-        <w:t xml:space="preserve">{{#hasPinnedNotes}}Important Notes:</w:t>
-      </w:r>
-    </w:p>
-    <w:p>
-      <w:r>
-        <w:t xml:space="preserve">{{#pinnedNotes}}{{.}}{{/pinnedNotes}}</w:t>
+        <w:t xml:space="preserve">Important Notes:</w:t>
+      </w:r>
+    </w:p>
+    <w:p>
+      <w:r>
+        <w:t xml:space="preserve">{{#pinnedNotes}}</w:t>
+      </w:r>
+    </w:p>
+    <w:p>
+      <w:r>
+        <w:t xml:space="preserve">• {{.}}</w:t>
+      </w:r>
+    </w:p>
+    <w:p>
+      <w:r>
+        <w:t xml:space="preserve">{{/pinnedNotes}}</w:t>
       </w:r>
     </w:p>
     <w:p>

</xml_diff>